<commit_message>
Docs: add institution, team member and teacher
Co-authored-by: Cursor <cursoragent@cursor.com>
</commit_message>
<xml_diff>
--- a/DOCUMENTACION_PARQUEADERO/Editables_DOCX/01_Descripcion_General.docx
+++ b/DOCUMENTACION_PARQUEADERO/Editables_DOCX/01_Descripcion_General.docx
@@ -19,12 +19,12 @@
           <wp:inline distB="0" distL="0" distR="0" distT="0">
             <wp:extent cx="2857500" cy="2371725"/>
             <wp:effectExtent b="0" l="0" r="0" t="0"/>
-            <wp:docPr id="1" name="image-RC2su9AgjvLEpukCxF69-.png"/>
+            <wp:docPr id="1" name="image-rs4zVqO0w696GpouS3ap6.png"/>
             <a:graphic>
               <a:graphicData uri="http://schemas.openxmlformats.org/drawingml/2006/picture">
                 <pic:pic>
                   <pic:nvPicPr>
-                    <pic:cNvPr id="1" name="image-RC2su9AgjvLEpukCxF69-.png" descr=""/>
+                    <pic:cNvPr id="1" name="image-rs4zVqO0w696GpouS3ap6.png" descr=""/>
                     <pic:cNvPicPr/>
                   </pic:nvPicPr>
                   <pic:blipFill>
@@ -186,10 +186,8 @@
               <w:spacing w:lineRule="auto"/>
             </w:pPr>
             <w:r>
-              <w:rPr>
-                <w:color w:val="A35F00"/>
-              </w:rPr>
-              <w:t xml:space="preserve">[Pendiente de completar]</w:t>
+              <w:rPr/>
+              <w:t xml:space="preserve">I.E.R. Santa María</w:t>
             </w:r>
           </w:p>
         </w:tc>
@@ -228,10 +226,48 @@
               <w:spacing w:lineRule="auto"/>
             </w:pPr>
             <w:r>
+              <w:rPr/>
+              <w:t xml:space="preserve">Loren</w:t>
+            </w:r>
+          </w:p>
+        </w:tc>
+      </w:tr>
+      <w:tr>
+        <w:trPr>
+          <w:cantSplit/>
+        </w:trPr>
+        <w:tc>
+          <w:tcPr>
+            <w:tcBorders>
+              <w:bottom w:val="single" w:sz="8" w:space="0" w:color="DCE6F2"/>
+            </w:tcBorders>
+          </w:tcPr>
+          <w:p>
+            <w:pPr>
+              <w:spacing w:lineRule="auto"/>
+            </w:pPr>
+            <w:r>
               <w:rPr>
-                <w:color w:val="A35F00"/>
+                <w:b/>
+                <w:color w:val="0B2A5B"/>
               </w:rPr>
-              <w:t xml:space="preserve">[Pendiente de completar]</w:t>
+              <w:t xml:space="preserve">Docente</w:t>
+            </w:r>
+          </w:p>
+        </w:tc>
+        <w:tc>
+          <w:tcPr>
+            <w:tcBorders>
+              <w:bottom w:val="single" w:sz="8" w:space="0" w:color="DCE6F2"/>
+            </w:tcBorders>
+          </w:tcPr>
+          <w:p>
+            <w:pPr>
+              <w:spacing w:lineRule="auto"/>
+            </w:pPr>
+            <w:r>
+              <w:rPr/>
+              <w:t xml:space="preserve">Liseth Giraldo</w:t>
             </w:r>
           </w:p>
         </w:tc>
@@ -808,11 +844,8 @@
               <w:spacing w:lineRule="auto"/>
             </w:pPr>
             <w:r>
-              <w:rPr>
-                <w:color w:val="A35F00"/>
-                <w:shd w:val="clear" w:fill="FFF4E0"/>
-              </w:rPr>
-              <w:t xml:space="preserve">[Pendiente de completar]</w:t>
+              <w:rPr/>
+              <w:t xml:space="preserve">I.E.R. Santa María</w:t>
             </w:r>
           </w:p>
         </w:tc>
@@ -860,11 +893,8 @@
               <w:spacing w:lineRule="auto"/>
             </w:pPr>
             <w:r>
-              <w:rPr>
-                <w:color w:val="A35F00"/>
-                <w:shd w:val="clear" w:fill="FFF4E0"/>
-              </w:rPr>
-              <w:t xml:space="preserve">[Pendiente de completar]</w:t>
+              <w:rPr/>
+              <w:t xml:space="preserve">Loren</w:t>
             </w:r>
           </w:p>
         </w:tc>
@@ -893,7 +923,7 @@
               <w:rPr>
                 <w:color w:val="0B2A5B"/>
               </w:rPr>
-              <w:t xml:space="preserve">Docente / Instructor</w:t>
+              <w:t xml:space="preserve">Docente</w:t>
             </w:r>
           </w:p>
         </w:tc>
@@ -913,11 +943,8 @@
               <w:spacing w:lineRule="auto"/>
             </w:pPr>
             <w:r>
-              <w:rPr>
-                <w:color w:val="A35F00"/>
-                <w:shd w:val="clear" w:fill="FFF4E0"/>
-              </w:rPr>
-              <w:t xml:space="preserve">[Pendiente de completar]</w:t>
+              <w:rPr/>
+              <w:t xml:space="preserve">Liseth Giraldo</w:t>
             </w:r>
           </w:p>
         </w:tc>

</xml_diff>